<commit_message>
Update Spinning Light Wand Files
</commit_message>
<xml_diff>
--- a/Toy_Instructions/Sound_Movement_Light/Kid_Connection_Spinning_Light_Wand/Working_Docs/Spinning_Light_Wand_Battery_Interrupter_Maker_Guide.docx
+++ b/Toy_Instructions/Sound_Movement_Light/Kid_Connection_Spinning_Light_Wand/Working_Docs/Spinning_Light_Wand_Battery_Interrupter_Maker_Guide.docx
@@ -5,6 +5,7 @@
     <w:p>
       <w:pPr>
         <w:pStyle w:val="Heading1"/>
+        <w:spacing w:before="0"/>
       </w:pPr>
       <w:r>
         <w:t>Requir</w:t>
@@ -45,7 +46,6 @@
                 <w:ilvl w:val="0"/>
                 <w:numId w:val="10"/>
               </w:numPr>
-              <w:jc w:val="center"/>
               <w:rPr>
                 <w:i/>
                 <w:iCs/>
@@ -56,7 +56,7 @@
                 <w:noProof/>
               </w:rPr>
               <w:drawing>
-                <wp:anchor distT="0" distB="0" distL="114300" distR="114300" simplePos="0" relativeHeight="251667466" behindDoc="0" locked="0" layoutInCell="1" allowOverlap="1" wp14:anchorId="66C0396E" wp14:editId="12948A67">
+                <wp:anchor distT="0" distB="0" distL="114300" distR="114300" simplePos="0" relativeHeight="251677706" behindDoc="0" locked="0" layoutInCell="1" allowOverlap="1" wp14:anchorId="66C0396E" wp14:editId="12948A67">
                   <wp:simplePos x="0" y="0"/>
                   <wp:positionH relativeFrom="column">
                     <wp:posOffset>616078</wp:posOffset>
@@ -129,7 +129,7 @@
                 <w:noProof/>
               </w:rPr>
               <w:drawing>
-                <wp:anchor distT="0" distB="0" distL="114300" distR="114300" simplePos="0" relativeHeight="251668490" behindDoc="0" locked="0" layoutInCell="1" allowOverlap="1" wp14:anchorId="7B392B5A" wp14:editId="6F1DD45F">
+                <wp:anchor distT="0" distB="0" distL="114300" distR="114300" simplePos="0" relativeHeight="251678730" behindDoc="0" locked="0" layoutInCell="1" allowOverlap="1" wp14:anchorId="7B392B5A" wp14:editId="6F1DD45F">
                   <wp:simplePos x="0" y="0"/>
                   <wp:positionH relativeFrom="column">
                     <wp:posOffset>197138</wp:posOffset>
@@ -216,6 +216,20 @@
             <w:r>
               <w:t>Kid Connection Spinning Light Wand Toy</w:t>
             </w:r>
+            <w:r>
+              <w:t xml:space="preserve"> (</w:t>
+            </w:r>
+            <w:hyperlink r:id="rId13" w:history="1">
+              <w:r>
+                <w:rPr>
+                  <w:rStyle w:val="Hyperlink"/>
+                </w:rPr>
+                <w:t>Walmart</w:t>
+              </w:r>
+            </w:hyperlink>
+            <w:r>
+              <w:t>)</w:t>
+            </w:r>
           </w:p>
           <w:p>
             <w:pPr>
@@ -265,11 +279,12 @@
               <w:t>3D printed stand, cover and button clamp</w:t>
             </w:r>
           </w:p>
+          <w:p/>
           <w:p>
             <w:r>
               <w:t xml:space="preserve">Refer to the </w:t>
             </w:r>
-            <w:hyperlink r:id="rId13" w:history="1">
+            <w:hyperlink r:id="rId14" w:history="1">
               <w:r>
                 <w:rPr>
                   <w:rStyle w:val="Hyperlink"/>
@@ -311,7 +326,7 @@
                 <w:noProof/>
               </w:rPr>
               <w:drawing>
-                <wp:anchor distT="0" distB="0" distL="114300" distR="114300" simplePos="0" relativeHeight="251670538" behindDoc="0" locked="0" layoutInCell="1" allowOverlap="1" wp14:anchorId="323D7567" wp14:editId="68D24331">
+                <wp:anchor distT="0" distB="0" distL="114300" distR="114300" simplePos="0" relativeHeight="251679754" behindDoc="0" locked="0" layoutInCell="1" allowOverlap="1" wp14:anchorId="323D7567" wp14:editId="68D24331">
                   <wp:simplePos x="0" y="0"/>
                   <wp:positionH relativeFrom="column">
                     <wp:posOffset>100426</wp:posOffset>
@@ -334,7 +349,7 @@
                           <pic:cNvPicPr/>
                         </pic:nvPicPr>
                         <pic:blipFill>
-                          <a:blip r:embed="rId14" cstate="print">
+                          <a:blip r:embed="rId15" cstate="print">
                             <a:extLst>
                               <a:ext uri="{28A0092B-C50C-407E-A947-70E740481C1C}">
                                 <a14:useLocalDpi xmlns:a14="http://schemas.microsoft.com/office/drawing/2010/main" val="0"/>
@@ -401,7 +416,7 @@
                 <w:szCs w:val="24"/>
               </w:rPr>
               <w:drawing>
-                <wp:anchor distT="0" distB="0" distL="114300" distR="114300" simplePos="0" relativeHeight="251672586" behindDoc="0" locked="0" layoutInCell="1" allowOverlap="1" wp14:anchorId="086F7DEC" wp14:editId="0D6E43B0">
+                <wp:anchor distT="0" distB="0" distL="114300" distR="114300" simplePos="0" relativeHeight="251680778" behindDoc="0" locked="0" layoutInCell="1" allowOverlap="1" wp14:anchorId="086F7DEC" wp14:editId="0D6E43B0">
                   <wp:simplePos x="0" y="0"/>
                   <wp:positionH relativeFrom="column">
                     <wp:posOffset>137795</wp:posOffset>
@@ -424,7 +439,7 @@
                           <pic:cNvPicPr/>
                         </pic:nvPicPr>
                         <pic:blipFill>
-                          <a:blip r:embed="rId15" cstate="print">
+                          <a:blip r:embed="rId16" cstate="print">
                             <a:extLst>
                               <a:ext uri="{28A0092B-C50C-407E-A947-70E740481C1C}">
                                 <a14:useLocalDpi xmlns:a14="http://schemas.microsoft.com/office/drawing/2010/main" val="0"/>
@@ -481,16 +496,9 @@
         </w:trPr>
         <w:tc>
           <w:tcPr>
-            <w:tcW w:w="6205" w:type="dxa"/>
-            <w:gridSpan w:val="2"/>
+            <w:tcW w:w="9265" w:type="dxa"/>
+            <w:gridSpan w:val="3"/>
           </w:tcPr>
-          <w:p>
-            <w:pPr>
-              <w:rPr>
-                <w:noProof/>
-              </w:rPr>
-            </w:pPr>
-          </w:p>
           <w:p>
             <w:pPr>
               <w:pStyle w:val="ListParagraph"/>
@@ -521,17 +529,9 @@
                 <w:szCs w:val="24"/>
               </w:rPr>
               <w:drawing>
-                <wp:anchor distT="0" distB="0" distL="114300" distR="114300" simplePos="0" relativeHeight="251674634" behindDoc="0" locked="0" layoutInCell="1" allowOverlap="1" wp14:anchorId="6D06126D" wp14:editId="5C7F9DC8">
-                  <wp:simplePos x="0" y="0"/>
-                  <wp:positionH relativeFrom="column">
-                    <wp:posOffset>472830</wp:posOffset>
-                  </wp:positionH>
-                  <wp:positionV relativeFrom="paragraph">
-                    <wp:posOffset>17839</wp:posOffset>
-                  </wp:positionV>
-                  <wp:extent cx="1536700" cy="1431290"/>
-                  <wp:effectExtent l="0" t="0" r="6350" b="0"/>
-                  <wp:wrapSquare wrapText="bothSides"/>
+                <wp:inline distT="0" distB="0" distL="0" distR="0" wp14:anchorId="6D06126D" wp14:editId="3FA48215">
+                  <wp:extent cx="1546051" cy="1440000"/>
+                  <wp:effectExtent l="0" t="0" r="0" b="8255"/>
                   <wp:docPr id="1983929125" name="Picture 1" descr="A computer screen shot of a black object&#10;&#10;AI-generated content may be incorrect."/>
                   <wp:cNvGraphicFramePr>
                     <a:graphicFrameLocks xmlns:a="http://schemas.openxmlformats.org/drawingml/2006/main" noChangeAspect="1"/>
@@ -544,7 +544,7 @@
                           <pic:cNvPicPr/>
                         </pic:nvPicPr>
                         <pic:blipFill rotWithShape="1">
-                          <a:blip r:embed="rId16" cstate="print">
+                          <a:blip r:embed="rId17" cstate="print">
                             <a:extLst>
                               <a:ext uri="{28A0092B-C50C-407E-A947-70E740481C1C}">
                                 <a14:useLocalDpi xmlns:a14="http://schemas.microsoft.com/office/drawing/2010/main" val="0"/>
@@ -557,7 +557,7 @@
                         <pic:spPr bwMode="auto">
                           <a:xfrm>
                             <a:off x="0" y="0"/>
-                            <a:ext cx="1536700" cy="1431290"/>
+                            <a:ext cx="1546051" cy="1440000"/>
                           </a:xfrm>
                           <a:prstGeom prst="rect">
                             <a:avLst/>
@@ -574,14 +574,16 @@
                       </pic:pic>
                     </a:graphicData>
                   </a:graphic>
-                  <wp14:sizeRelH relativeFrom="margin">
-                    <wp14:pctWidth>0</wp14:pctWidth>
-                  </wp14:sizeRelH>
-                  <wp14:sizeRelV relativeFrom="margin">
-                    <wp14:pctHeight>0</wp14:pctHeight>
-                  </wp14:sizeRelV>
-                </wp:anchor>
+                </wp:inline>
               </w:drawing>
+            </w:r>
+            <w:r>
+              <w:rPr>
+                <w:bCs/>
+                <w:sz w:val="24"/>
+                <w:szCs w:val="24"/>
+              </w:rPr>
+              <w:t xml:space="preserve"> </w:t>
             </w:r>
             <w:r>
               <w:rPr>
@@ -591,17 +593,9 @@
                 <w:szCs w:val="24"/>
               </w:rPr>
               <w:drawing>
-                <wp:anchor distT="0" distB="0" distL="114300" distR="114300" simplePos="0" relativeHeight="251673610" behindDoc="0" locked="0" layoutInCell="1" allowOverlap="1" wp14:anchorId="6002E242" wp14:editId="573662F8">
-                  <wp:simplePos x="0" y="0"/>
-                  <wp:positionH relativeFrom="column">
-                    <wp:posOffset>2148702</wp:posOffset>
-                  </wp:positionH>
-                  <wp:positionV relativeFrom="paragraph">
-                    <wp:posOffset>19813</wp:posOffset>
-                  </wp:positionV>
-                  <wp:extent cx="1631315" cy="1442085"/>
-                  <wp:effectExtent l="0" t="0" r="6985" b="5715"/>
-                  <wp:wrapSquare wrapText="bothSides"/>
+                <wp:inline distT="0" distB="0" distL="0" distR="0" wp14:anchorId="6002E242" wp14:editId="7F2D8FA2">
+                  <wp:extent cx="1628956" cy="1440000"/>
+                  <wp:effectExtent l="0" t="0" r="0" b="8255"/>
                   <wp:docPr id="759044210" name="Picture 3" descr="A grey object with holes&#10;&#10;AI-generated content may be incorrect."/>
                   <wp:cNvGraphicFramePr>
                     <a:graphicFrameLocks xmlns:a="http://schemas.openxmlformats.org/drawingml/2006/main" noChangeAspect="1"/>
@@ -614,7 +608,7 @@
                           <pic:cNvPicPr/>
                         </pic:nvPicPr>
                         <pic:blipFill rotWithShape="1">
-                          <a:blip r:embed="rId17" cstate="print">
+                          <a:blip r:embed="rId18" cstate="print">
                             <a:extLst>
                               <a:ext uri="{28A0092B-C50C-407E-A947-70E740481C1C}">
                                 <a14:useLocalDpi xmlns:a14="http://schemas.microsoft.com/office/drawing/2010/main" val="0"/>
@@ -627,7 +621,7 @@
                         <pic:spPr bwMode="auto">
                           <a:xfrm>
                             <a:off x="0" y="0"/>
-                            <a:ext cx="1631315" cy="1442085"/>
+                            <a:ext cx="1628956" cy="1440000"/>
                           </a:xfrm>
                           <a:prstGeom prst="rect">
                             <a:avLst/>
@@ -644,87 +638,17 @@
                       </pic:pic>
                     </a:graphicData>
                   </a:graphic>
-                  <wp14:sizeRelH relativeFrom="margin">
-                    <wp14:pctWidth>0</wp14:pctWidth>
-                  </wp14:sizeRelH>
-                  <wp14:sizeRelV relativeFrom="margin">
-                    <wp14:pctHeight>0</wp14:pctHeight>
-                  </wp14:sizeRelV>
-                </wp:anchor>
+                </wp:inline>
               </w:drawing>
             </w:r>
-          </w:p>
-          <w:p>
-            <w:pPr>
+            <w:r>
               <w:rPr>
                 <w:bCs/>
                 <w:sz w:val="24"/>
                 <w:szCs w:val="24"/>
               </w:rPr>
-            </w:pPr>
-          </w:p>
-          <w:p>
-            <w:pPr>
-              <w:rPr>
-                <w:bCs/>
-                <w:sz w:val="24"/>
-                <w:szCs w:val="24"/>
-              </w:rPr>
-            </w:pPr>
-          </w:p>
-          <w:p>
-            <w:pPr>
-              <w:rPr>
-                <w:bCs/>
-                <w:sz w:val="24"/>
-                <w:szCs w:val="24"/>
-              </w:rPr>
-            </w:pPr>
-          </w:p>
-          <w:p>
-            <w:pPr>
-              <w:rPr>
-                <w:bCs/>
-                <w:sz w:val="24"/>
-                <w:szCs w:val="24"/>
-              </w:rPr>
-            </w:pPr>
-          </w:p>
-          <w:p>
-            <w:pPr>
-              <w:rPr>
-                <w:bCs/>
-                <w:sz w:val="24"/>
-                <w:szCs w:val="24"/>
-              </w:rPr>
-            </w:pPr>
-          </w:p>
-          <w:p>
-            <w:pPr>
-              <w:rPr>
-                <w:bCs/>
-                <w:sz w:val="24"/>
-                <w:szCs w:val="24"/>
-              </w:rPr>
-            </w:pPr>
-          </w:p>
-          <w:p>
-            <w:pPr>
-              <w:rPr>
-                <w:bCs/>
-                <w:sz w:val="24"/>
-                <w:szCs w:val="24"/>
-              </w:rPr>
-            </w:pPr>
-          </w:p>
-          <w:p>
-            <w:pPr>
-              <w:rPr>
-                <w:bCs/>
-                <w:sz w:val="24"/>
-                <w:szCs w:val="24"/>
-              </w:rPr>
-            </w:pPr>
+              <w:t xml:space="preserve"> </w:t>
+            </w:r>
             <w:r>
               <w:rPr>
                 <w:bCs/>
@@ -733,17 +657,9 @@
                 <w:szCs w:val="24"/>
               </w:rPr>
               <w:drawing>
-                <wp:anchor distT="0" distB="0" distL="114300" distR="114300" simplePos="0" relativeHeight="251675658" behindDoc="0" locked="0" layoutInCell="1" allowOverlap="1" wp14:anchorId="4C860646" wp14:editId="5AAA6D77">
-                  <wp:simplePos x="0" y="0"/>
-                  <wp:positionH relativeFrom="column">
-                    <wp:posOffset>972942</wp:posOffset>
-                  </wp:positionH>
-                  <wp:positionV relativeFrom="paragraph">
-                    <wp:posOffset>15240</wp:posOffset>
-                  </wp:positionV>
-                  <wp:extent cx="1974215" cy="1266190"/>
-                  <wp:effectExtent l="0" t="0" r="6985" b="0"/>
-                  <wp:wrapSquare wrapText="bothSides"/>
+                <wp:inline distT="0" distB="0" distL="0" distR="0" wp14:anchorId="54BCDDF9" wp14:editId="17A9F742">
+                  <wp:extent cx="2020694" cy="1296000"/>
+                  <wp:effectExtent l="0" t="0" r="0" b="0"/>
                   <wp:docPr id="1641236603" name="Picture 2" descr="A black bracelet on a white background&#10;&#10;AI-generated content may be incorrect."/>
                   <wp:cNvGraphicFramePr>
                     <a:graphicFrameLocks xmlns:a="http://schemas.openxmlformats.org/drawingml/2006/main" noChangeAspect="1"/>
@@ -756,7 +672,7 @@
                           <pic:cNvPicPr/>
                         </pic:nvPicPr>
                         <pic:blipFill rotWithShape="1">
-                          <a:blip r:embed="rId18" cstate="print">
+                          <a:blip r:embed="rId19" cstate="print">
                             <a:extLst>
                               <a:ext uri="{28A0092B-C50C-407E-A947-70E740481C1C}">
                                 <a14:useLocalDpi xmlns:a14="http://schemas.microsoft.com/office/drawing/2010/main" val="0"/>
@@ -769,7 +685,7 @@
                         <pic:spPr bwMode="auto">
                           <a:xfrm>
                             <a:off x="0" y="0"/>
-                            <a:ext cx="1974215" cy="1266190"/>
+                            <a:ext cx="2020694" cy="1296000"/>
                           </a:xfrm>
                           <a:prstGeom prst="rect">
                             <a:avLst/>
@@ -786,96 +702,27 @@
                       </pic:pic>
                     </a:graphicData>
                   </a:graphic>
-                  <wp14:sizeRelH relativeFrom="margin">
-                    <wp14:pctWidth>0</wp14:pctWidth>
-                  </wp14:sizeRelH>
-                  <wp14:sizeRelV relativeFrom="margin">
-                    <wp14:pctHeight>0</wp14:pctHeight>
-                  </wp14:sizeRelV>
-                </wp:anchor>
+                </wp:inline>
               </w:drawing>
             </w:r>
           </w:p>
           <w:p>
             <w:pPr>
               <w:rPr>
-                <w:bCs/>
-                <w:sz w:val="24"/>
-                <w:szCs w:val="24"/>
-              </w:rPr>
-            </w:pPr>
-          </w:p>
-          <w:p>
-            <w:pPr>
-              <w:rPr>
-                <w:bCs/>
-                <w:sz w:val="24"/>
-                <w:szCs w:val="24"/>
-              </w:rPr>
-            </w:pPr>
-          </w:p>
-          <w:p>
-            <w:pPr>
-              <w:rPr>
-                <w:bCs/>
-                <w:sz w:val="24"/>
-                <w:szCs w:val="24"/>
-              </w:rPr>
-            </w:pPr>
-          </w:p>
-          <w:p>
-            <w:pPr>
-              <w:rPr>
-                <w:bCs/>
-                <w:sz w:val="24"/>
-                <w:szCs w:val="24"/>
-              </w:rPr>
-            </w:pPr>
-          </w:p>
-          <w:p>
-            <w:pPr>
-              <w:rPr>
-                <w:bCs/>
-                <w:sz w:val="24"/>
-                <w:szCs w:val="24"/>
-              </w:rPr>
-            </w:pPr>
-          </w:p>
-          <w:p>
-            <w:pPr>
-              <w:rPr>
-                <w:bCs/>
-                <w:sz w:val="24"/>
-                <w:szCs w:val="24"/>
-              </w:rPr>
-            </w:pPr>
-          </w:p>
-        </w:tc>
-        <w:tc>
-          <w:tcPr>
-            <w:tcW w:w="3060" w:type="dxa"/>
-            <w:vMerge/>
-          </w:tcPr>
-          <w:p>
-            <w:pPr>
-              <w:jc w:val="center"/>
-              <w:rPr>
                 <w:b/>
-                <w:sz w:val="24"/>
-                <w:szCs w:val="24"/>
+                <w:sz w:val="2"/>
+                <w:szCs w:val="2"/>
               </w:rPr>
             </w:pPr>
           </w:p>
         </w:tc>
       </w:tr>
     </w:tbl>
-    <w:p/>
     <w:p>
       <w:pPr>
         <w:pStyle w:val="Heading1"/>
       </w:pPr>
       <w:r>
-        <w:lastRenderedPageBreak/>
         <w:t>Required Tools</w:t>
       </w:r>
     </w:p>
@@ -975,6 +822,7 @@
         <w:pStyle w:val="Heading1"/>
       </w:pPr>
       <w:r>
+        <w:lastRenderedPageBreak/>
         <w:t>Assembly Instructions</w:t>
       </w:r>
     </w:p>
@@ -1015,9 +863,9 @@
                 <w:noProof/>
               </w:rPr>
               <w:drawing>
-                <wp:inline distT="0" distB="0" distL="0" distR="0" wp14:anchorId="41EB4DF6" wp14:editId="05E29357">
-                  <wp:extent cx="2147977" cy="2863969"/>
-                  <wp:effectExtent l="0" t="0" r="5080" b="0"/>
+                <wp:inline distT="0" distB="0" distL="0" distR="0" wp14:anchorId="41EB4DF6" wp14:editId="27B76DB4">
+                  <wp:extent cx="2088107" cy="2389160"/>
+                  <wp:effectExtent l="0" t="0" r="7620" b="0"/>
                   <wp:docPr id="1498982069" name="Picture 2" descr="A yellow object with a white circle and a black square&#10;&#10;Description automatically generated"/>
                   <wp:cNvGraphicFramePr>
                     <a:graphicFrameLocks xmlns:a="http://schemas.openxmlformats.org/drawingml/2006/main" noChangeAspect="1"/>
@@ -1029,26 +877,35 @@
                           <pic:cNvPr id="1498982069" name="Picture 2" descr="A yellow object with a white circle and a black square&#10;&#10;Description automatically generated"/>
                           <pic:cNvPicPr/>
                         </pic:nvPicPr>
-                        <pic:blipFill>
-                          <a:blip r:embed="rId19" cstate="print">
+                        <pic:blipFill rotWithShape="1">
+                          <a:blip r:embed="rId20" cstate="print">
                             <a:extLst>
                               <a:ext uri="{28A0092B-C50C-407E-A947-70E740481C1C}">
                                 <a14:useLocalDpi xmlns:a14="http://schemas.microsoft.com/office/drawing/2010/main" val="0"/>
                               </a:ext>
                             </a:extLst>
                           </a:blip>
+                          <a:srcRect t="10009" b="4177"/>
                           <a:stretch>
                             <a:fillRect/>
                           </a:stretch>
                         </pic:blipFill>
-                        <pic:spPr>
+                        <pic:spPr bwMode="auto">
                           <a:xfrm>
                             <a:off x="0" y="0"/>
-                            <a:ext cx="2157706" cy="2876941"/>
+                            <a:ext cx="2100379" cy="2403202"/>
                           </a:xfrm>
                           <a:prstGeom prst="rect">
                             <a:avLst/>
                           </a:prstGeom>
+                          <a:ln>
+                            <a:noFill/>
+                          </a:ln>
+                          <a:extLst>
+                            <a:ext uri="{53640926-AAD7-44D8-BBD7-CCE9431645EC}">
+                              <a14:shadowObscured xmlns:a14="http://schemas.microsoft.com/office/drawing/2010/main"/>
+                            </a:ext>
+                          </a:extLst>
                         </pic:spPr>
                       </pic:pic>
                     </a:graphicData>
@@ -1102,16 +959,14 @@
           </w:p>
         </w:tc>
       </w:tr>
-      <w:bookmarkEnd w:id="0"/>
-      <w:bookmarkEnd w:id="1"/>
     </w:tbl>
-    <w:p/>
+    <w:bookmarkEnd w:id="0"/>
+    <w:bookmarkEnd w:id="1"/>
     <w:p>
       <w:pPr>
         <w:pStyle w:val="Heading2"/>
       </w:pPr>
       <w:r>
-        <w:lastRenderedPageBreak/>
         <w:t xml:space="preserve">Step </w:t>
       </w:r>
       <w:r>
@@ -1144,13 +999,13 @@
               <mc:AlternateContent>
                 <mc:Choice Requires="wps">
                   <w:drawing>
-                    <wp:anchor distT="0" distB="0" distL="114300" distR="114300" simplePos="0" relativeHeight="251658242" behindDoc="0" locked="0" layoutInCell="1" allowOverlap="1" wp14:anchorId="04233531" wp14:editId="1B6438ED">
+                    <wp:anchor distT="0" distB="0" distL="114300" distR="114300" simplePos="0" relativeHeight="251658242" behindDoc="0" locked="0" layoutInCell="1" allowOverlap="1" wp14:anchorId="04233531" wp14:editId="65D9AEE5">
                       <wp:simplePos x="0" y="0"/>
                       <wp:positionH relativeFrom="column">
-                        <wp:posOffset>1503045</wp:posOffset>
+                        <wp:posOffset>1496221</wp:posOffset>
                       </wp:positionH>
                       <wp:positionV relativeFrom="paragraph">
-                        <wp:posOffset>1156335</wp:posOffset>
+                        <wp:posOffset>610425</wp:posOffset>
                       </wp:positionV>
                       <wp:extent cx="165100" cy="177800"/>
                       <wp:effectExtent l="19050" t="19050" r="25400" b="12700"/>
@@ -1210,12 +1065,12 @@
                     </wp:anchor>
                   </w:drawing>
                 </mc:Choice>
-                <mc:Fallback xmlns:a="http://schemas.openxmlformats.org/drawingml/2006/main" xmlns:pic="http://schemas.openxmlformats.org/drawingml/2006/picture" xmlns:a14="http://schemas.microsoft.com/office/drawing/2010/main">
+                <mc:Fallback>
                   <w:pict>
-                    <v:shapetype id="_x0000_t120" coordsize="21600,21600" o:spt="120" path="m10800,qx,10800,10800,21600,21600,10800,10800,xe" w14:anchorId="6FC32302">
-                      <v:path textboxrect="3163,3163,18437,18437" gradientshapeok="t" o:connecttype="custom" o:connectlocs="10800,0;3163,3163;0,10800;3163,18437;10800,21600;18437,18437;21600,10800;18437,3163"/>
+                    <v:shapetype w14:anchorId="1DF26826" id="_x0000_t120" coordsize="21600,21600" o:spt="120" path="m10800,qx,10800,10800,21600,21600,10800,10800,xe">
+                      <v:path gradientshapeok="t" o:connecttype="custom" o:connectlocs="10800,0;3163,3163;0,10800;3163,18437;10800,21600;18437,18437;21600,10800;18437,3163" textboxrect="3163,3163,18437,18437"/>
                     </v:shapetype>
-                    <v:shape id="Flowchart: Connector 6" style="position:absolute;margin-left:118.35pt;margin-top:91.05pt;width:13pt;height:14pt;z-index:251719680;visibility:visible;mso-wrap-style:square;mso-width-percent:0;mso-height-percent:0;mso-wrap-distance-left:9pt;mso-wrap-distance-top:0;mso-wrap-distance-right:9pt;mso-wrap-distance-bottom:0;mso-position-horizontal:absolute;mso-position-horizontal-relative:text;mso-position-vertical:absolute;mso-position-vertical-relative:text;mso-width-percent:0;mso-height-percent:0;mso-width-relative:margin;mso-height-relative:margin;v-text-anchor:middle" o:spid="_x0000_s1026" filled="f" strokecolor="red" strokeweight="2.25pt" type="#_x0000_t120" o:gfxdata="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">
+                    <v:shape id="Flowchart: Connector 6" o:spid="_x0000_s1026" type="#_x0000_t120" style="position:absolute;margin-left:117.8pt;margin-top:48.05pt;width:13pt;height:14pt;z-index:251658242;visibility:visible;mso-wrap-style:square;mso-width-percent:0;mso-height-percent:0;mso-wrap-distance-left:9pt;mso-wrap-distance-top:0;mso-wrap-distance-right:9pt;mso-wrap-distance-bottom:0;mso-position-horizontal:absolute;mso-position-horizontal-relative:text;mso-position-vertical:absolute;mso-position-vertical-relative:text;mso-width-percent:0;mso-height-percent:0;mso-width-relative:margin;mso-height-relative:margin;v-text-anchor:middle" o:gfxdata="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" filled="f" strokecolor="red" strokeweight="2.25pt">
                       <v:stroke joinstyle="miter"/>
                     </v:shape>
                   </w:pict>
@@ -1229,13 +1084,13 @@
               <mc:AlternateContent>
                 <mc:Choice Requires="wps">
                   <w:drawing>
-                    <wp:anchor distT="0" distB="0" distL="114300" distR="114300" simplePos="0" relativeHeight="251658241" behindDoc="0" locked="0" layoutInCell="1" allowOverlap="1" wp14:anchorId="187F4FC4" wp14:editId="4B45299A">
+                    <wp:anchor distT="0" distB="0" distL="114300" distR="114300" simplePos="0" relativeHeight="251658241" behindDoc="0" locked="0" layoutInCell="1" allowOverlap="1" wp14:anchorId="187F4FC4" wp14:editId="3D242314">
                       <wp:simplePos x="0" y="0"/>
                       <wp:positionH relativeFrom="column">
                         <wp:posOffset>1826895</wp:posOffset>
                       </wp:positionH>
                       <wp:positionV relativeFrom="paragraph">
-                        <wp:posOffset>1016635</wp:posOffset>
+                        <wp:posOffset>457077</wp:posOffset>
                       </wp:positionV>
                       <wp:extent cx="165100" cy="184150"/>
                       <wp:effectExtent l="19050" t="19050" r="25400" b="25400"/>
@@ -1289,9 +1144,9 @@
                     </wp:anchor>
                   </w:drawing>
                 </mc:Choice>
-                <mc:Fallback xmlns:a="http://schemas.openxmlformats.org/drawingml/2006/main" xmlns:pic="http://schemas.openxmlformats.org/drawingml/2006/picture" xmlns:a14="http://schemas.microsoft.com/office/drawing/2010/main">
+                <mc:Fallback>
                   <w:pict>
-                    <v:shape id="Flowchart: Connector 5" style="position:absolute;margin-left:143.85pt;margin-top:80.05pt;width:13pt;height:14.5pt;z-index:251718656;visibility:visible;mso-wrap-style:square;mso-wrap-distance-left:9pt;mso-wrap-distance-top:0;mso-wrap-distance-right:9pt;mso-wrap-distance-bottom:0;mso-position-horizontal:absolute;mso-position-horizontal-relative:text;mso-position-vertical:absolute;mso-position-vertical-relative:text;v-text-anchor:middle" o:spid="_x0000_s1026" filled="f" strokecolor="red" strokeweight="2.25pt" type="#_x0000_t120" o:gfxdata="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" w14:anchorId="30D1644F">
+                    <v:shape w14:anchorId="5745760A" id="Flowchart: Connector 5" o:spid="_x0000_s1026" type="#_x0000_t120" style="position:absolute;margin-left:143.85pt;margin-top:36pt;width:13pt;height:14.5pt;z-index:251658241;visibility:visible;mso-wrap-style:square;mso-wrap-distance-left:9pt;mso-wrap-distance-top:0;mso-wrap-distance-right:9pt;mso-wrap-distance-bottom:0;mso-position-horizontal:absolute;mso-position-horizontal-relative:text;mso-position-vertical:absolute;mso-position-vertical-relative:text;v-text-anchor:middle" o:gfxdata="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" filled="f" strokecolor="red" strokeweight="2.25pt">
                       <v:stroke joinstyle="miter"/>
                     </v:shape>
                   </w:pict>
@@ -1305,13 +1160,13 @@
               <mc:AlternateContent>
                 <mc:Choice Requires="wps">
                   <w:drawing>
-                    <wp:anchor distT="0" distB="0" distL="114300" distR="114300" simplePos="0" relativeHeight="251658240" behindDoc="0" locked="0" layoutInCell="1" allowOverlap="1" wp14:anchorId="211DBED0" wp14:editId="08B65BC9">
+                    <wp:anchor distT="0" distB="0" distL="114300" distR="114300" simplePos="0" relativeHeight="251658240" behindDoc="0" locked="0" layoutInCell="1" allowOverlap="1" wp14:anchorId="211DBED0" wp14:editId="311B8988">
                       <wp:simplePos x="0" y="0"/>
                       <wp:positionH relativeFrom="column">
                         <wp:posOffset>1655445</wp:posOffset>
                       </wp:positionH>
                       <wp:positionV relativeFrom="paragraph">
-                        <wp:posOffset>902335</wp:posOffset>
+                        <wp:posOffset>356425</wp:posOffset>
                       </wp:positionV>
                       <wp:extent cx="190500" cy="190500"/>
                       <wp:effectExtent l="19050" t="19050" r="19050" b="19050"/>
@@ -1365,9 +1220,9 @@
                     </wp:anchor>
                   </w:drawing>
                 </mc:Choice>
-                <mc:Fallback xmlns:a="http://schemas.openxmlformats.org/drawingml/2006/main" xmlns:pic="http://schemas.openxmlformats.org/drawingml/2006/picture" xmlns:a14="http://schemas.microsoft.com/office/drawing/2010/main">
+                <mc:Fallback>
                   <w:pict>
-                    <v:shape id="Flowchart: Connector 4" style="position:absolute;margin-left:130.35pt;margin-top:71.05pt;width:15pt;height:15pt;z-index:251717632;visibility:visible;mso-wrap-style:square;mso-wrap-distance-left:9pt;mso-wrap-distance-top:0;mso-wrap-distance-right:9pt;mso-wrap-distance-bottom:0;mso-position-horizontal:absolute;mso-position-horizontal-relative:text;mso-position-vertical:absolute;mso-position-vertical-relative:text;v-text-anchor:middle" o:spid="_x0000_s1026" filled="f" strokecolor="red" strokeweight="2.25pt" type="#_x0000_t120" o:gfxdata="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" w14:anchorId="32CB77A9">
+                    <v:shape w14:anchorId="61BA6B7E" id="Flowchart: Connector 4" o:spid="_x0000_s1026" type="#_x0000_t120" style="position:absolute;margin-left:130.35pt;margin-top:28.05pt;width:15pt;height:15pt;z-index:251658240;visibility:visible;mso-wrap-style:square;mso-wrap-distance-left:9pt;mso-wrap-distance-top:0;mso-wrap-distance-right:9pt;mso-wrap-distance-bottom:0;mso-position-horizontal:absolute;mso-position-horizontal-relative:text;mso-position-vertical:absolute;mso-position-vertical-relative:text;v-text-anchor:middle" o:gfxdata="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" filled="f" strokecolor="red" strokeweight="2.25pt">
                       <v:stroke joinstyle="miter"/>
                     </v:shape>
                   </w:pict>
@@ -1379,9 +1234,9 @@
                 <w:noProof/>
               </w:rPr>
               <w:drawing>
-                <wp:inline distT="0" distB="0" distL="0" distR="0" wp14:anchorId="2A865D8B" wp14:editId="1B27033D">
-                  <wp:extent cx="2343150" cy="3124202"/>
-                  <wp:effectExtent l="0" t="0" r="0" b="0"/>
+                <wp:inline distT="0" distB="0" distL="0" distR="0" wp14:anchorId="2A865D8B" wp14:editId="6C8B4567">
+                  <wp:extent cx="2342515" cy="1828800"/>
+                  <wp:effectExtent l="0" t="0" r="635" b="0"/>
                   <wp:docPr id="70484470" name="Picture 3" descr="A yellow and silver piece of electronics&#10;&#10;Description automatically generated"/>
                   <wp:cNvGraphicFramePr>
                     <a:graphicFrameLocks xmlns:a="http://schemas.openxmlformats.org/drawingml/2006/main" noChangeAspect="1"/>
@@ -1393,26 +1248,35 @@
                           <pic:cNvPr id="70484470" name="Picture 3" descr="A yellow and silver piece of electronics&#10;&#10;Description automatically generated"/>
                           <pic:cNvPicPr/>
                         </pic:nvPicPr>
-                        <pic:blipFill>
-                          <a:blip r:embed="rId20" cstate="print">
+                        <pic:blipFill rotWithShape="1">
+                          <a:blip r:embed="rId21" cstate="print">
                             <a:extLst>
                               <a:ext uri="{28A0092B-C50C-407E-A947-70E740481C1C}">
                                 <a14:useLocalDpi xmlns:a14="http://schemas.microsoft.com/office/drawing/2010/main" val="0"/>
                               </a:ext>
                             </a:extLst>
                           </a:blip>
+                          <a:srcRect t="17692" b="23756"/>
                           <a:stretch>
                             <a:fillRect/>
                           </a:stretch>
                         </pic:blipFill>
-                        <pic:spPr>
+                        <pic:spPr bwMode="auto">
                           <a:xfrm>
                             <a:off x="0" y="0"/>
-                            <a:ext cx="2357708" cy="3143612"/>
+                            <a:ext cx="2357708" cy="1840661"/>
                           </a:xfrm>
                           <a:prstGeom prst="rect">
                             <a:avLst/>
                           </a:prstGeom>
+                          <a:ln>
+                            <a:noFill/>
+                          </a:ln>
+                          <a:extLst>
+                            <a:ext uri="{53640926-AAD7-44D8-BBD7-CCE9431645EC}">
+                              <a14:shadowObscured xmlns:a14="http://schemas.microsoft.com/office/drawing/2010/main"/>
+                            </a:ext>
+                          </a:extLst>
                         </pic:spPr>
                       </pic:pic>
                     </a:graphicData>
@@ -1453,7 +1317,6 @@
         </w:tc>
       </w:tr>
     </w:tbl>
-    <w:p/>
     <w:p>
       <w:pPr>
         <w:pStyle w:val="Heading2"/>
@@ -1481,14 +1344,17 @@
             <w:tcW w:w="4675" w:type="dxa"/>
           </w:tcPr>
           <w:p>
+            <w:pPr>
+              <w:jc w:val="center"/>
+            </w:pPr>
             <w:r>
               <w:rPr>
                 <w:noProof/>
               </w:rPr>
               <w:drawing>
-                <wp:inline distT="0" distB="0" distL="0" distR="0" wp14:anchorId="525294E9" wp14:editId="0D309093">
-                  <wp:extent cx="2810934" cy="2108200"/>
-                  <wp:effectExtent l="0" t="0" r="8890" b="6350"/>
+                <wp:inline distT="0" distB="0" distL="0" distR="0" wp14:anchorId="525294E9" wp14:editId="3CC68A61">
+                  <wp:extent cx="2674961" cy="1896472"/>
+                  <wp:effectExtent l="0" t="0" r="0" b="8890"/>
                   <wp:docPr id="1736877336" name="Picture 7" descr="A pair of scissors and a battery&#10;&#10;Description automatically generated"/>
                   <wp:cNvGraphicFramePr>
                     <a:graphicFrameLocks xmlns:a="http://schemas.openxmlformats.org/drawingml/2006/main" noChangeAspect="1"/>
@@ -1500,26 +1366,35 @@
                           <pic:cNvPr id="1736877336" name="Picture 7" descr="A pair of scissors and a battery&#10;&#10;Description automatically generated"/>
                           <pic:cNvPicPr/>
                         </pic:nvPicPr>
-                        <pic:blipFill>
-                          <a:blip r:embed="rId21" cstate="print">
+                        <pic:blipFill rotWithShape="1">
+                          <a:blip r:embed="rId22" cstate="print">
                             <a:extLst>
                               <a:ext uri="{28A0092B-C50C-407E-A947-70E740481C1C}">
                                 <a14:useLocalDpi xmlns:a14="http://schemas.microsoft.com/office/drawing/2010/main" val="0"/>
                               </a:ext>
                             </a:extLst>
                           </a:blip>
+                          <a:srcRect b="5470"/>
                           <a:stretch>
                             <a:fillRect/>
                           </a:stretch>
                         </pic:blipFill>
-                        <pic:spPr>
+                        <pic:spPr bwMode="auto">
                           <a:xfrm>
                             <a:off x="0" y="0"/>
-                            <a:ext cx="2818666" cy="2113999"/>
+                            <a:ext cx="2685078" cy="1903644"/>
                           </a:xfrm>
                           <a:prstGeom prst="rect">
                             <a:avLst/>
                           </a:prstGeom>
+                          <a:ln>
+                            <a:noFill/>
+                          </a:ln>
+                          <a:extLst>
+                            <a:ext uri="{53640926-AAD7-44D8-BBD7-CCE9431645EC}">
+                              <a14:shadowObscured xmlns:a14="http://schemas.microsoft.com/office/drawing/2010/main"/>
+                            </a:ext>
+                          </a:extLst>
                         </pic:spPr>
                       </pic:pic>
                     </a:graphicData>
@@ -1538,15 +1413,19 @@
               <w:spacing w:after="160" w:line="259" w:lineRule="auto"/>
             </w:pPr>
             <w:r>
-              <w:t xml:space="preserve">Check what size the batteries are of the toy you wish to use the interrupter with. This toy uses AAA batteries. There are circles on the orange PCB indicated battery size. </w:t>
-            </w:r>
-          </w:p>
-          <w:p>
-            <w:pPr>
-              <w:spacing w:after="160" w:line="259" w:lineRule="auto"/>
-            </w:pPr>
-            <w:r>
-              <w:t xml:space="preserve">Locate the circle labeled AAA and cut the PCB to that size. </w:t>
+              <w:t>There are circles on the orange PCB indicated battery size.</w:t>
+            </w:r>
+            <w:r>
+              <w:t xml:space="preserve"> Since t</w:t>
+            </w:r>
+            <w:r>
+              <w:t>his toy uses AAA batteries</w:t>
+            </w:r>
+            <w:r>
+              <w:t>, l</w:t>
+            </w:r>
+            <w:r>
+              <w:t xml:space="preserve">ocate the circle labeled AAA and cut the PCB to that size. </w:t>
             </w:r>
           </w:p>
           <w:p>
@@ -1563,12 +1442,8 @@
       </w:pPr>
       <w:bookmarkStart w:id="2" w:name="_Hlk115641000"/>
       <w:bookmarkStart w:id="3" w:name="_Hlk115691002"/>
-    </w:p>
-    <w:p>
-      <w:pPr>
-        <w:pStyle w:val="Heading2"/>
-      </w:pPr>
       <w:r>
+        <w:lastRenderedPageBreak/>
         <w:t xml:space="preserve">Step </w:t>
       </w:r>
       <w:r>
@@ -1618,7 +1493,7 @@
                           <pic:cNvPicPr/>
                         </pic:nvPicPr>
                         <pic:blipFill>
-                          <a:blip r:embed="rId22" cstate="print">
+                          <a:blip r:embed="rId23" cstate="print">
                             <a:extLst>
                               <a:ext uri="{28A0092B-C50C-407E-A947-70E740481C1C}">
                                 <a14:useLocalDpi xmlns:a14="http://schemas.microsoft.com/office/drawing/2010/main" val="0"/>
@@ -1725,7 +1600,7 @@
                           <pic:cNvPicPr/>
                         </pic:nvPicPr>
                         <pic:blipFill>
-                          <a:blip r:embed="rId23" cstate="print">
+                          <a:blip r:embed="rId24" cstate="print">
                             <a:extLst>
                               <a:ext uri="{28A0092B-C50C-407E-A947-70E740481C1C}">
                                 <a14:useLocalDpi xmlns:a14="http://schemas.microsoft.com/office/drawing/2010/main" val="0"/>
@@ -1754,15 +1629,14 @@
           </w:p>
         </w:tc>
       </w:tr>
+    </w:tbl>
+    <w:p>
+      <w:pPr>
+        <w:pStyle w:val="Heading2"/>
+      </w:pPr>
+      <w:bookmarkStart w:id="5" w:name="_Hlk150434045"/>
       <w:bookmarkEnd w:id="3"/>
       <w:bookmarkEnd w:id="4"/>
-    </w:tbl>
-    <w:p/>
-    <w:p>
-      <w:pPr>
-        <w:pStyle w:val="Heading2"/>
-      </w:pPr>
-      <w:bookmarkStart w:id="5" w:name="_Hlk150434045"/>
       <w:r>
         <w:t xml:space="preserve">Step </w:t>
       </w:r>
@@ -1861,7 +1735,7 @@
                     </wp:anchor>
                   </w:drawing>
                 </mc:Choice>
-                <mc:Fallback xmlns:a="http://schemas.openxmlformats.org/drawingml/2006/main" xmlns:pic="http://schemas.openxmlformats.org/drawingml/2006/picture" xmlns:a14="http://schemas.microsoft.com/office/drawing/2010/main">
+                <mc:Fallback xmlns:a14="http://schemas.microsoft.com/office/drawing/2010/main" xmlns:pic="http://schemas.openxmlformats.org/drawingml/2006/picture" xmlns:a="http://schemas.openxmlformats.org/drawingml/2006/main">
                   <w:pict>
                     <v:shapetype id="_x0000_t105" coordsize="21600,21600" o:spt="105" adj="12960,19440,14400" path="wr,0@3@23,0@22@4,0@15,0@1@23@7,0@13@2l@14@2@8@22@12@2at,0@3@23@11@2@17@26@15,0@1@23@17@26@15@22xewr,0@3@23@4,0@17@26nfe" w14:anchorId="1F20C27F">
                       <v:stroke joinstyle="miter"/>
@@ -1949,7 +1823,7 @@
                           <pic:cNvPicPr/>
                         </pic:nvPicPr>
                         <pic:blipFill>
-                          <a:blip r:embed="rId24" cstate="print">
+                          <a:blip r:embed="rId25" cstate="print">
                             <a:extLst>
                               <a:ext uri="{28A0092B-C50C-407E-A947-70E740481C1C}">
                                 <a14:useLocalDpi xmlns:a14="http://schemas.microsoft.com/office/drawing/2010/main" val="0"/>
@@ -2018,6 +1892,7 @@
       </w:pPr>
       <w:bookmarkStart w:id="6" w:name="_Hlk115641074"/>
       <w:r>
+        <w:lastRenderedPageBreak/>
         <w:t xml:space="preserve"> </w:t>
       </w:r>
       <w:r>
@@ -2044,6 +1919,9 @@
           </w:tcPr>
           <w:bookmarkEnd w:id="6"/>
           <w:p>
+            <w:pPr>
+              <w:jc w:val="center"/>
+            </w:pPr>
             <w:r>
               <w:rPr>
                 <w:noProof/>
@@ -2051,13 +1929,13 @@
               <mc:AlternateContent>
                 <mc:Choice Requires="wps">
                   <w:drawing>
-                    <wp:anchor distT="0" distB="0" distL="114300" distR="114300" simplePos="0" relativeHeight="251658243" behindDoc="0" locked="0" layoutInCell="1" allowOverlap="1" wp14:anchorId="4ABF45B4" wp14:editId="13B1FEAA">
+                    <wp:anchor distT="0" distB="0" distL="114300" distR="114300" simplePos="0" relativeHeight="251658243" behindDoc="0" locked="0" layoutInCell="1" allowOverlap="1" wp14:anchorId="4ABF45B4" wp14:editId="0B420861">
                       <wp:simplePos x="0" y="0"/>
                       <wp:positionH relativeFrom="column">
-                        <wp:posOffset>860917</wp:posOffset>
+                        <wp:posOffset>1113017</wp:posOffset>
                       </wp:positionH>
                       <wp:positionV relativeFrom="paragraph">
-                        <wp:posOffset>1584865</wp:posOffset>
+                        <wp:posOffset>988112</wp:posOffset>
                       </wp:positionV>
                       <wp:extent cx="101517" cy="495300"/>
                       <wp:effectExtent l="31433" t="63817" r="6667" b="44768"/>
@@ -2116,9 +1994,9 @@
                     </wp:anchor>
                   </w:drawing>
                 </mc:Choice>
-                <mc:Fallback xmlns:a="http://schemas.openxmlformats.org/drawingml/2006/main" xmlns:pic="http://schemas.openxmlformats.org/drawingml/2006/picture" xmlns:a14="http://schemas.microsoft.com/office/drawing/2010/main">
+                <mc:Fallback>
                   <w:pict>
-                    <v:shapetype id="_x0000_t68" coordsize="21600,21600" o:spt="68" adj="5400,5400" path="m0@0l@1@0@1,21600@2,21600@2@0,21600@0,10800,xe" w14:anchorId="2B427ABE">
+                    <v:shapetype w14:anchorId="38BEB6E4" id="_x0000_t68" coordsize="21600,21600" o:spt="68" adj="5400,5400" path="m0@0l@1@0@1,21600@2,21600@2@0,21600@0,10800,xe">
                       <v:stroke joinstyle="miter"/>
                       <v:formulas>
                         <v:f eqn="val #0"/>
@@ -2127,12 +2005,12 @@
                         <v:f eqn="prod #0 #1 10800"/>
                         <v:f eqn="sum #0 0 @3"/>
                       </v:formulas>
-                      <v:path textboxrect="@1,@4,@2,21600" o:connecttype="custom" o:connectlocs="10800,0;0,@0;10800,21600;21600,@0" o:connectangles="270,180,90,0"/>
+                      <v:path o:connecttype="custom" o:connectlocs="10800,0;0,@0;10800,21600;21600,@0" o:connectangles="270,180,90,0" textboxrect="@1,@4,@2,21600"/>
                       <v:handles>
                         <v:h position="#1,#0" xrange="0,10800" yrange="0,21600"/>
                       </v:handles>
                     </v:shapetype>
-                    <v:shape id="Arrow: Up 18" style="position:absolute;margin-left:67.8pt;margin-top:124.8pt;width:8pt;height:39pt;rotation:5290551fd;z-index:251721728;visibility:visible;mso-wrap-style:square;mso-width-percent:0;mso-wrap-distance-left:9pt;mso-wrap-distance-top:0;mso-wrap-distance-right:9pt;mso-wrap-distance-bottom:0;mso-position-horizontal:absolute;mso-position-horizontal-relative:text;mso-position-vertical:absolute;mso-position-vertical-relative:text;mso-width-percent:0;mso-width-relative:margin;v-text-anchor:middle" o:spid="_x0000_s1026" fillcolor="red" strokecolor="red" strokeweight="2.25pt" type="#_x0000_t68" adj="2214" o:gfxdata="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"/>
+                    <v:shape id="Arrow: Up 18" o:spid="_x0000_s1026" type="#_x0000_t68" style="position:absolute;margin-left:87.65pt;margin-top:77.8pt;width:8pt;height:39pt;rotation:5290551fd;z-index:251658243;visibility:visible;mso-wrap-style:square;mso-width-percent:0;mso-wrap-distance-left:9pt;mso-wrap-distance-top:0;mso-wrap-distance-right:9pt;mso-wrap-distance-bottom:0;mso-position-horizontal:absolute;mso-position-horizontal-relative:text;mso-position-vertical:absolute;mso-position-vertical-relative:text;mso-width-percent:0;mso-width-relative:margin;v-text-anchor:middle" o:gfxdata="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" adj="2214" fillcolor="red" strokecolor="red" strokeweight="2.25pt"/>
                   </w:pict>
                 </mc:Fallback>
               </mc:AlternateContent>
@@ -2142,9 +2020,9 @@
                 <w:noProof/>
               </w:rPr>
               <w:drawing>
-                <wp:inline distT="0" distB="0" distL="0" distR="0" wp14:anchorId="0D50B2D2" wp14:editId="2E0B6254">
-                  <wp:extent cx="2114550" cy="2819400"/>
-                  <wp:effectExtent l="0" t="0" r="0" b="0"/>
+                <wp:inline distT="0" distB="0" distL="0" distR="0" wp14:anchorId="0D50B2D2" wp14:editId="68F23063">
+                  <wp:extent cx="2112611" cy="1699146"/>
+                  <wp:effectExtent l="0" t="0" r="2540" b="0"/>
                   <wp:docPr id="2117692307" name="Picture 12" descr="A blue and red device with a red tube&#10;&#10;Description automatically generated"/>
                   <wp:cNvGraphicFramePr>
                     <a:graphicFrameLocks xmlns:a="http://schemas.openxmlformats.org/drawingml/2006/main" noChangeAspect="1"/>
@@ -2156,26 +2034,35 @@
                           <pic:cNvPr id="2117692307" name="Picture 12" descr="A blue and red device with a red tube&#10;&#10;Description automatically generated"/>
                           <pic:cNvPicPr/>
                         </pic:nvPicPr>
-                        <pic:blipFill>
-                          <a:blip r:embed="rId25" cstate="print">
+                        <pic:blipFill rotWithShape="1">
+                          <a:blip r:embed="rId26" cstate="print">
                             <a:extLst>
                               <a:ext uri="{28A0092B-C50C-407E-A947-70E740481C1C}">
                                 <a14:useLocalDpi xmlns:a14="http://schemas.microsoft.com/office/drawing/2010/main" val="0"/>
                               </a:ext>
                             </a:extLst>
                           </a:blip>
+                          <a:srcRect t="17187" b="22491"/>
                           <a:stretch>
                             <a:fillRect/>
                           </a:stretch>
                         </pic:blipFill>
-                        <pic:spPr>
+                        <pic:spPr bwMode="auto">
                           <a:xfrm>
                             <a:off x="0" y="0"/>
-                            <a:ext cx="2122148" cy="2829531"/>
+                            <a:ext cx="2122148" cy="1706816"/>
                           </a:xfrm>
                           <a:prstGeom prst="rect">
                             <a:avLst/>
                           </a:prstGeom>
+                          <a:ln>
+                            <a:noFill/>
+                          </a:ln>
+                          <a:extLst>
+                            <a:ext uri="{53640926-AAD7-44D8-BBD7-CCE9431645EC}">
+                              <a14:shadowObscured xmlns:a14="http://schemas.microsoft.com/office/drawing/2010/main"/>
+                            </a:ext>
+                          </a:extLst>
                         </pic:spPr>
                       </pic:pic>
                     </a:graphicData>
@@ -2224,11 +2111,6 @@
       <w:pPr>
         <w:pStyle w:val="Heading2"/>
       </w:pPr>
-    </w:p>
-    <w:p>
-      <w:pPr>
-        <w:pStyle w:val="Heading2"/>
-      </w:pPr>
       <w:r>
         <w:t>Step 7</w:t>
       </w:r>
@@ -2240,19 +2122,24 @@
         <w:tblLook w:val="04A0" w:firstRow="1" w:lastRow="0" w:firstColumn="1" w:lastColumn="0" w:noHBand="0" w:noVBand="1"/>
       </w:tblPr>
       <w:tblGrid>
-        <w:gridCol w:w="3276"/>
-        <w:gridCol w:w="2798"/>
-        <w:gridCol w:w="3276"/>
+        <w:gridCol w:w="3275"/>
+        <w:gridCol w:w="2756"/>
+        <w:gridCol w:w="3319"/>
       </w:tblGrid>
       <w:tr>
         <w:trPr>
-          <w:trHeight w:val="4978"/>
+          <w:trHeight w:val="3487"/>
         </w:trPr>
         <w:tc>
           <w:tcPr>
             <w:tcW w:w="3276" w:type="dxa"/>
           </w:tcPr>
           <w:p>
+            <w:pPr>
+              <w:rPr>
+                <w:noProof/>
+              </w:rPr>
+            </w:pPr>
             <w:r>
               <w:rPr>
                 <w:noProof/>
@@ -2260,13 +2147,13 @@
               <mc:AlternateContent>
                 <mc:Choice Requires="wps">
                   <w:drawing>
-                    <wp:anchor distT="0" distB="0" distL="114300" distR="114300" simplePos="0" relativeHeight="251658245" behindDoc="0" locked="0" layoutInCell="1" allowOverlap="1" wp14:anchorId="06908126" wp14:editId="46105425">
+                    <wp:anchor distT="0" distB="0" distL="114300" distR="114300" simplePos="0" relativeHeight="251658245" behindDoc="0" locked="0" layoutInCell="1" allowOverlap="1" wp14:anchorId="06908126" wp14:editId="13D05F40">
                       <wp:simplePos x="0" y="0"/>
                       <wp:positionH relativeFrom="column">
-                        <wp:posOffset>328295</wp:posOffset>
+                        <wp:posOffset>300999</wp:posOffset>
                       </wp:positionH>
                       <wp:positionV relativeFrom="paragraph">
-                        <wp:posOffset>1207770</wp:posOffset>
+                        <wp:posOffset>914344</wp:posOffset>
                       </wp:positionV>
                       <wp:extent cx="495300" cy="495300"/>
                       <wp:effectExtent l="19050" t="19050" r="19050" b="19050"/>
@@ -2320,9 +2207,9 @@
                     </wp:anchor>
                   </w:drawing>
                 </mc:Choice>
-                <mc:Fallback xmlns:a="http://schemas.openxmlformats.org/drawingml/2006/main" xmlns:pic="http://schemas.openxmlformats.org/drawingml/2006/picture" xmlns:a14="http://schemas.microsoft.com/office/drawing/2010/main">
+                <mc:Fallback>
                   <w:pict>
-                    <v:shape id="Flowchart: Connector 20" style="position:absolute;margin-left:25.85pt;margin-top:95.1pt;width:39pt;height:39pt;z-index:251723776;visibility:visible;mso-wrap-style:square;mso-wrap-distance-left:9pt;mso-wrap-distance-top:0;mso-wrap-distance-right:9pt;mso-wrap-distance-bottom:0;mso-position-horizontal:absolute;mso-position-horizontal-relative:text;mso-position-vertical:absolute;mso-position-vertical-relative:text;v-text-anchor:middle" o:spid="_x0000_s1026" filled="f" strokecolor="black [3213]" strokeweight="3pt" type="#_x0000_t120" o:gfxdata="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" w14:anchorId="7977F8A6">
+                    <v:shape w14:anchorId="5FCBA9F5" id="Flowchart: Connector 20" o:spid="_x0000_s1026" type="#_x0000_t120" style="position:absolute;margin-left:23.7pt;margin-top:1in;width:39pt;height:39pt;z-index:251658245;visibility:visible;mso-wrap-style:square;mso-wrap-distance-left:9pt;mso-wrap-distance-top:0;mso-wrap-distance-right:9pt;mso-wrap-distance-bottom:0;mso-position-horizontal:absolute;mso-position-horizontal-relative:text;mso-position-vertical:absolute;mso-position-vertical-relative:text;v-text-anchor:middle" o:gfxdata="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" filled="f" strokecolor="black [3213]" strokeweight="3pt">
                       <v:stroke joinstyle="miter"/>
                     </v:shape>
                   </w:pict>
@@ -2334,9 +2221,9 @@
                 <w:noProof/>
               </w:rPr>
               <w:drawing>
-                <wp:inline distT="0" distB="0" distL="0" distR="0" wp14:anchorId="1A229E06" wp14:editId="3D151D07">
-                  <wp:extent cx="1936750" cy="2582333"/>
-                  <wp:effectExtent l="0" t="0" r="6350" b="8890"/>
+                <wp:inline distT="0" distB="0" distL="0" distR="0" wp14:anchorId="1A229E06" wp14:editId="5CF951A2">
+                  <wp:extent cx="1924841" cy="2268000"/>
+                  <wp:effectExtent l="0" t="0" r="0" b="0"/>
                   <wp:docPr id="885478918" name="Picture 885478918" descr="A close up of a toy&#10;&#10;Description automatically generated"/>
                   <wp:cNvGraphicFramePr>
                     <a:graphicFrameLocks xmlns:a="http://schemas.openxmlformats.org/drawingml/2006/main" noChangeAspect="1"/>
@@ -2348,26 +2235,35 @@
                           <pic:cNvPr id="88161528" name="Picture 13" descr="A close up of a toy&#10;&#10;Description automatically generated"/>
                           <pic:cNvPicPr/>
                         </pic:nvPicPr>
-                        <pic:blipFill>
-                          <a:blip r:embed="rId26" cstate="print">
+                        <pic:blipFill rotWithShape="1">
+                          <a:blip r:embed="rId27" cstate="print">
                             <a:extLst>
                               <a:ext uri="{28A0092B-C50C-407E-A947-70E740481C1C}">
                                 <a14:useLocalDpi xmlns:a14="http://schemas.microsoft.com/office/drawing/2010/main" val="0"/>
                               </a:ext>
                             </a:extLst>
                           </a:blip>
+                          <a:srcRect t="11629"/>
                           <a:stretch>
                             <a:fillRect/>
                           </a:stretch>
                         </pic:blipFill>
-                        <pic:spPr>
+                        <pic:spPr bwMode="auto">
                           <a:xfrm>
                             <a:off x="0" y="0"/>
-                            <a:ext cx="1944610" cy="2592813"/>
+                            <a:ext cx="1924841" cy="2268000"/>
                           </a:xfrm>
                           <a:prstGeom prst="rect">
                             <a:avLst/>
                           </a:prstGeom>
+                          <a:ln>
+                            <a:noFill/>
+                          </a:ln>
+                          <a:extLst>
+                            <a:ext uri="{53640926-AAD7-44D8-BBD7-CCE9431645EC}">
+                              <a14:shadowObscured xmlns:a14="http://schemas.microsoft.com/office/drawing/2010/main"/>
+                            </a:ext>
+                          </a:extLst>
                         </pic:spPr>
                       </pic:pic>
                     </a:graphicData>
@@ -2403,6 +2299,13 @@
               </w:rPr>
               <w:t>Next, locate the 3D printed button clamp. The hooks on the ends of the clamp should fit into the screw slot of the toy, and the middle of the clamp should be pushing the toy’s button, so that the toy is stuck in the on position</w:t>
             </w:r>
+            <w:r>
+              <w:rPr>
+                <w:sz w:val="24"/>
+                <w:szCs w:val="24"/>
+              </w:rPr>
+              <w:t>.</w:t>
+            </w:r>
           </w:p>
         </w:tc>
         <w:tc>
@@ -2412,6 +2315,9 @@
           <w:p>
             <w:pPr>
               <w:spacing w:after="160" w:line="259" w:lineRule="auto"/>
+              <w:rPr>
+                <w:noProof/>
+              </w:rPr>
             </w:pPr>
             <w:r>
               <w:rPr>
@@ -2420,13 +2326,13 @@
               <mc:AlternateContent>
                 <mc:Choice Requires="wps">
                   <w:drawing>
-                    <wp:anchor distT="0" distB="0" distL="114300" distR="114300" simplePos="0" relativeHeight="251658246" behindDoc="0" locked="0" layoutInCell="1" allowOverlap="1" wp14:anchorId="6B2F0C73" wp14:editId="7145AA3D">
+                    <wp:anchor distT="0" distB="0" distL="114300" distR="114300" simplePos="0" relativeHeight="251658246" behindDoc="0" locked="0" layoutInCell="1" allowOverlap="1" wp14:anchorId="6B2F0C73" wp14:editId="74E923CC">
                       <wp:simplePos x="0" y="0"/>
                       <wp:positionH relativeFrom="column">
-                        <wp:posOffset>1100455</wp:posOffset>
+                        <wp:posOffset>1045835</wp:posOffset>
                       </wp:positionH>
                       <wp:positionV relativeFrom="paragraph">
-                        <wp:posOffset>1512570</wp:posOffset>
+                        <wp:posOffset>1321066</wp:posOffset>
                       </wp:positionV>
                       <wp:extent cx="146050" cy="184150"/>
                       <wp:effectExtent l="38100" t="38100" r="25400" b="25400"/>
@@ -2447,7 +2353,7 @@
                               </a:prstGeom>
                               <a:ln w="38100">
                                 <a:solidFill>
-                                  <a:schemeClr val="tx1"/>
+                                  <a:schemeClr val="bg1"/>
                                 </a:solidFill>
                                 <a:tailEnd type="triangle"/>
                               </a:ln>
@@ -2473,14 +2379,14 @@
                     </wp:anchor>
                   </w:drawing>
                 </mc:Choice>
-                <mc:Fallback xmlns:a="http://schemas.openxmlformats.org/drawingml/2006/main" xmlns:pic="http://schemas.openxmlformats.org/drawingml/2006/picture" xmlns:a14="http://schemas.microsoft.com/office/drawing/2010/main">
+                <mc:Fallback>
                   <w:pict>
-                    <v:shapetype id="_x0000_t32" coordsize="21600,21600" o:oned="t" filled="f" o:spt="32" path="m,l21600,21600e" w14:anchorId="735C24B8">
-                      <v:path fillok="f" arrowok="t" o:connecttype="none"/>
+                    <v:shapetype w14:anchorId="3D8AB056" id="_x0000_t32" coordsize="21600,21600" o:spt="32" o:oned="t" path="m,l21600,21600e" filled="f">
+                      <v:path arrowok="t" fillok="f" o:connecttype="none"/>
                       <o:lock v:ext="edit" shapetype="t"/>
                     </v:shapetype>
-                    <v:shape id="Straight Arrow Connector 21" style="position:absolute;margin-left:86.65pt;margin-top:119.1pt;width:11.5pt;height:14.5pt;flip:x y;z-index:251724800;visibility:visible;mso-wrap-style:square;mso-wrap-distance-left:9pt;mso-wrap-distance-top:0;mso-wrap-distance-right:9pt;mso-wrap-distance-bottom:0;mso-position-horizontal:absolute;mso-position-horizontal-relative:text;mso-position-vertical:absolute;mso-position-vertical-relative:text" o:spid="_x0000_s1026" strokecolor="black [3213]" strokeweight="3pt" type="#_x0000_t32" o:gfxdata="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">
-                      <v:stroke joinstyle="miter" endarrow="block"/>
+                    <v:shape id="Straight Arrow Connector 21" o:spid="_x0000_s1026" type="#_x0000_t32" style="position:absolute;margin-left:82.35pt;margin-top:104pt;width:11.5pt;height:14.5pt;flip:x y;z-index:251658246;visibility:visible;mso-wrap-style:square;mso-wrap-distance-left:9pt;mso-wrap-distance-top:0;mso-wrap-distance-right:9pt;mso-wrap-distance-bottom:0;mso-position-horizontal:absolute;mso-position-horizontal-relative:text;mso-position-vertical:absolute;mso-position-vertical-relative:text" o:gfxdata="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" strokecolor="white [3212]" strokeweight="3pt">
+                      <v:stroke endarrow="block" joinstyle="miter"/>
                     </v:shape>
                   </w:pict>
                 </mc:Fallback>
@@ -2491,8 +2397,8 @@
                 <w:noProof/>
               </w:rPr>
               <w:drawing>
-                <wp:inline distT="0" distB="0" distL="0" distR="0" wp14:anchorId="6E076F01" wp14:editId="2E3A74EC">
-                  <wp:extent cx="1943100" cy="2590800"/>
+                <wp:inline distT="0" distB="0" distL="0" distR="0" wp14:anchorId="6E076F01" wp14:editId="79186A51">
+                  <wp:extent cx="1970945" cy="2268000"/>
                   <wp:effectExtent l="0" t="0" r="0" b="0"/>
                   <wp:docPr id="626324908" name="Picture 626324908" descr="A close up of a toy&#10;&#10;Description automatically generated"/>
                   <wp:cNvGraphicFramePr>
@@ -2505,26 +2411,35 @@
                           <pic:cNvPr id="881554935" name="Picture 15" descr="A close up of a toy&#10;&#10;Description automatically generated"/>
                           <pic:cNvPicPr/>
                         </pic:nvPicPr>
-                        <pic:blipFill>
-                          <a:blip r:embed="rId27" cstate="print">
+                        <pic:blipFill rotWithShape="1">
+                          <a:blip r:embed="rId28" cstate="print">
                             <a:extLst>
                               <a:ext uri="{28A0092B-C50C-407E-A947-70E740481C1C}">
                                 <a14:useLocalDpi xmlns:a14="http://schemas.microsoft.com/office/drawing/2010/main" val="0"/>
                               </a:ext>
                             </a:extLst>
                           </a:blip>
+                          <a:srcRect t="13696"/>
                           <a:stretch>
                             <a:fillRect/>
                           </a:stretch>
                         </pic:blipFill>
-                        <pic:spPr>
+                        <pic:spPr bwMode="auto">
                           <a:xfrm>
                             <a:off x="0" y="0"/>
-                            <a:ext cx="1953390" cy="2604520"/>
+                            <a:ext cx="1970945" cy="2268000"/>
                           </a:xfrm>
                           <a:prstGeom prst="rect">
                             <a:avLst/>
                           </a:prstGeom>
+                          <a:ln>
+                            <a:noFill/>
+                          </a:ln>
+                          <a:extLst>
+                            <a:ext uri="{53640926-AAD7-44D8-BBD7-CCE9431645EC}">
+                              <a14:shadowObscured xmlns:a14="http://schemas.microsoft.com/office/drawing/2010/main"/>
+                            </a:ext>
+                          </a:extLst>
                         </pic:spPr>
                       </pic:pic>
                     </a:graphicData>
@@ -2536,14 +2451,12 @@
         </w:tc>
       </w:tr>
     </w:tbl>
-    <w:p/>
     <w:p>
       <w:pPr>
         <w:pStyle w:val="Heading2"/>
       </w:pPr>
       <w:bookmarkStart w:id="7" w:name="_Hlk150435865"/>
       <w:r>
-        <w:lastRenderedPageBreak/>
         <w:t xml:space="preserve">Step </w:t>
       </w:r>
       <w:r>
@@ -2562,7 +2475,7 @@
       </w:tblGrid>
       <w:tr>
         <w:trPr>
-          <w:trHeight w:val="4270"/>
+          <w:trHeight w:val="3767"/>
         </w:trPr>
         <w:tc>
           <w:tcPr>
@@ -2570,14 +2483,17 @@
           </w:tcPr>
           <w:bookmarkEnd w:id="7"/>
           <w:p>
+            <w:pPr>
+              <w:jc w:val="center"/>
+            </w:pPr>
             <w:r>
               <w:rPr>
                 <w:noProof/>
               </w:rPr>
               <w:drawing>
-                <wp:inline distT="0" distB="0" distL="0" distR="0" wp14:anchorId="594167FF" wp14:editId="6FC3A34E">
-                  <wp:extent cx="2108200" cy="2810933"/>
-                  <wp:effectExtent l="0" t="0" r="6350" b="8890"/>
+                <wp:inline distT="0" distB="0" distL="0" distR="0" wp14:anchorId="594167FF" wp14:editId="2C3088B5">
+                  <wp:extent cx="1968072" cy="2388358"/>
+                  <wp:effectExtent l="0" t="0" r="0" b="0"/>
                   <wp:docPr id="1994248646" name="Picture 16" descr="A toy on a table&#10;&#10;Description automatically generated"/>
                   <wp:cNvGraphicFramePr>
                     <a:graphicFrameLocks xmlns:a="http://schemas.openxmlformats.org/drawingml/2006/main" noChangeAspect="1"/>
@@ -2589,35 +2505,41 @@
                           <pic:cNvPr id="1994248646" name="Picture 16" descr="A toy on a table&#10;&#10;Description automatically generated"/>
                           <pic:cNvPicPr/>
                         </pic:nvPicPr>
-                        <pic:blipFill>
-                          <a:blip r:embed="rId28" cstate="print">
+                        <pic:blipFill rotWithShape="1">
+                          <a:blip r:embed="rId29" cstate="print">
                             <a:extLst>
                               <a:ext uri="{28A0092B-C50C-407E-A947-70E740481C1C}">
                                 <a14:useLocalDpi xmlns:a14="http://schemas.microsoft.com/office/drawing/2010/main" val="0"/>
                               </a:ext>
                             </a:extLst>
                           </a:blip>
+                          <a:srcRect t="8983"/>
                           <a:stretch>
                             <a:fillRect/>
                           </a:stretch>
                         </pic:blipFill>
-                        <pic:spPr>
+                        <pic:spPr bwMode="auto">
                           <a:xfrm>
                             <a:off x="0" y="0"/>
-                            <a:ext cx="2115046" cy="2820060"/>
+                            <a:ext cx="1977113" cy="2399330"/>
                           </a:xfrm>
                           <a:prstGeom prst="rect">
                             <a:avLst/>
                           </a:prstGeom>
+                          <a:ln>
+                            <a:noFill/>
+                          </a:ln>
+                          <a:extLst>
+                            <a:ext uri="{53640926-AAD7-44D8-BBD7-CCE9431645EC}">
+                              <a14:shadowObscured xmlns:a14="http://schemas.microsoft.com/office/drawing/2010/main"/>
+                            </a:ext>
+                          </a:extLst>
                         </pic:spPr>
                       </pic:pic>
                     </a:graphicData>
                   </a:graphic>
                 </wp:inline>
               </w:drawing>
-            </w:r>
-            <w:r>
-              <w:t xml:space="preserve"> </w:t>
             </w:r>
           </w:p>
         </w:tc>
@@ -2651,18 +2573,34 @@
           <w:p>
             <w:pPr>
               <w:spacing w:after="160" w:line="259" w:lineRule="auto"/>
+              <w:rPr>
+                <w:sz w:val="24"/>
+                <w:szCs w:val="24"/>
+              </w:rPr>
             </w:pPr>
           </w:p>
           <w:p>
             <w:pPr>
               <w:spacing w:after="160" w:line="259" w:lineRule="auto"/>
+              <w:rPr>
+                <w:sz w:val="24"/>
+                <w:szCs w:val="24"/>
+              </w:rPr>
             </w:pPr>
           </w:p>
           <w:p>
             <w:pPr>
               <w:spacing w:after="160" w:line="259" w:lineRule="auto"/>
+              <w:rPr>
+                <w:sz w:val="24"/>
+                <w:szCs w:val="24"/>
+              </w:rPr>
             </w:pPr>
             <w:r>
+              <w:rPr>
+                <w:sz w:val="24"/>
+                <w:szCs w:val="24"/>
+              </w:rPr>
               <w:t xml:space="preserve">If the toy does not work, make sure the clamp is pushing the button on, and check the position of the interrupter. </w:t>
             </w:r>
           </w:p>
@@ -2671,12 +2609,15 @@
     </w:tbl>
     <w:p>
       <w:pPr>
-        <w:pStyle w:val="Heading2"/>
+        <w:rPr>
+          <w:sz w:val="6"/>
+          <w:szCs w:val="6"/>
+        </w:rPr>
       </w:pPr>
     </w:p>
     <w:sectPr>
-      <w:headerReference w:type="default" r:id="rId29"/>
-      <w:footerReference w:type="default" r:id="rId30"/>
+      <w:headerReference w:type="default" r:id="rId30"/>
+      <w:footerReference w:type="default" r:id="rId31"/>
       <w:pgSz w:w="12240" w:h="15840"/>
       <w:pgMar w:top="1440" w:right="1440" w:bottom="1440" w:left="1440" w:header="720" w:footer="708" w:gutter="0"/>
       <w:cols w:space="708"/>
@@ -2887,14 +2828,6 @@
     <w:r>
       <w:rPr>
         <w:color w:val="404040" w:themeColor="text1" w:themeTint="BF"/>
-        <w:sz w:val="18"/>
-        <w:szCs w:val="18"/>
-      </w:rPr>
-      <w:tab/>
-    </w:r>
-    <w:r>
-      <w:rPr>
-        <w:color w:val="404040" w:themeColor="text1" w:themeTint="BF"/>
         <w:sz w:val="16"/>
         <w:szCs w:val="16"/>
       </w:rPr>
@@ -3072,7 +3005,7 @@
         <w:sz w:val="16"/>
         <w:szCs w:val="16"/>
       </w:rPr>
-      <w:t>1.0</w:t>
+      <w:t>1.</w:t>
     </w:r>
     <w:r>
       <w:rPr>
@@ -3083,7 +3016,7 @@
         <w:sz w:val="16"/>
         <w:szCs w:val="16"/>
       </w:rPr>
-      <w:t xml:space="preserve"> | </w:t>
+      <w:t>1</w:t>
     </w:r>
     <w:r>
       <w:rPr>
@@ -3094,40 +3027,7 @@
         <w:sz w:val="16"/>
         <w:szCs w:val="16"/>
       </w:rPr>
-      <w:t>November</w:t>
-    </w:r>
-    <w:r>
-      <w:rPr>
-        <w:rFonts w:ascii="Calibri" w:eastAsia="Calibri" w:hAnsi="Calibri" w:cs="Calibri"/>
-        <w:b/>
-        <w:bCs/>
-        <w:color w:val="646464"/>
-        <w:sz w:val="16"/>
-        <w:szCs w:val="16"/>
-      </w:rPr>
-      <w:t xml:space="preserve"> 202</w:t>
-    </w:r>
-    <w:r>
-      <w:rPr>
-        <w:rFonts w:ascii="Calibri" w:eastAsia="Calibri" w:hAnsi="Calibri" w:cs="Calibri"/>
-        <w:b/>
-        <w:bCs/>
-        <w:color w:val="646464"/>
-        <w:sz w:val="16"/>
-        <w:szCs w:val="16"/>
-      </w:rPr>
-      <w:t>3</w:t>
-    </w:r>
-    <w:r>
-      <w:rPr>
-        <w:rFonts w:ascii="Calibri" w:eastAsia="Calibri" w:hAnsi="Calibri" w:cs="Calibri"/>
-        <w:b/>
-        <w:bCs/>
-        <w:color w:val="646464"/>
-        <w:sz w:val="16"/>
-        <w:szCs w:val="16"/>
-      </w:rPr>
-      <w:t xml:space="preserve">                                                                                                                                               </w:t>
+      <w:t xml:space="preserve"> | </w:t>
     </w:r>
     <w:r>
       <w:rPr>
@@ -3211,6 +3111,17 @@
         </wp:anchor>
       </w:drawing>
     </w:r>
+    <w:r>
+      <w:rPr>
+        <w:rFonts w:ascii="Calibri" w:eastAsia="Calibri" w:hAnsi="Calibri" w:cs="Calibri"/>
+        <w:b/>
+        <w:bCs/>
+        <w:color w:val="646464"/>
+        <w:sz w:val="16"/>
+        <w:szCs w:val="16"/>
+      </w:rPr>
+      <w:t>August 2026</w:t>
+    </w:r>
   </w:p>
   <w:p>
     <w:pPr>
@@ -3891,7 +3802,7 @@
       <w:lvlText w:val="%1."/>
       <w:lvlJc w:val="left"/>
       <w:pPr>
-        <w:ind w:left="720" w:hanging="360"/>
+        <w:ind w:left="360" w:hanging="360"/>
       </w:pPr>
       <w:rPr>
         <w:rFonts w:hint="default"/>
@@ -3903,7 +3814,7 @@
       <w:lvlText w:val="%2."/>
       <w:lvlJc w:val="left"/>
       <w:pPr>
-        <w:ind w:left="1440" w:hanging="360"/>
+        <w:ind w:left="1080" w:hanging="360"/>
       </w:pPr>
     </w:lvl>
     <w:lvl w:ilvl="2" w:tplc="1009001B" w:tentative="1">
@@ -3912,7 +3823,7 @@
       <w:lvlText w:val="%3."/>
       <w:lvlJc w:val="right"/>
       <w:pPr>
-        <w:ind w:left="2160" w:hanging="180"/>
+        <w:ind w:left="1800" w:hanging="180"/>
       </w:pPr>
     </w:lvl>
     <w:lvl w:ilvl="3" w:tplc="1009000F" w:tentative="1">
@@ -3921,7 +3832,7 @@
       <w:lvlText w:val="%4."/>
       <w:lvlJc w:val="left"/>
       <w:pPr>
-        <w:ind w:left="2880" w:hanging="360"/>
+        <w:ind w:left="2520" w:hanging="360"/>
       </w:pPr>
     </w:lvl>
     <w:lvl w:ilvl="4" w:tplc="10090019" w:tentative="1">
@@ -3930,7 +3841,7 @@
       <w:lvlText w:val="%5."/>
       <w:lvlJc w:val="left"/>
       <w:pPr>
-        <w:ind w:left="3600" w:hanging="360"/>
+        <w:ind w:left="3240" w:hanging="360"/>
       </w:pPr>
     </w:lvl>
     <w:lvl w:ilvl="5" w:tplc="1009001B" w:tentative="1">
@@ -3939,7 +3850,7 @@
       <w:lvlText w:val="%6."/>
       <w:lvlJc w:val="right"/>
       <w:pPr>
-        <w:ind w:left="4320" w:hanging="180"/>
+        <w:ind w:left="3960" w:hanging="180"/>
       </w:pPr>
     </w:lvl>
     <w:lvl w:ilvl="6" w:tplc="1009000F" w:tentative="1">
@@ -3948,7 +3859,7 @@
       <w:lvlText w:val="%7."/>
       <w:lvlJc w:val="left"/>
       <w:pPr>
-        <w:ind w:left="5040" w:hanging="360"/>
+        <w:ind w:left="4680" w:hanging="360"/>
       </w:pPr>
     </w:lvl>
     <w:lvl w:ilvl="7" w:tplc="10090019" w:tentative="1">
@@ -3957,7 +3868,7 @@
       <w:lvlText w:val="%8."/>
       <w:lvlJc w:val="left"/>
       <w:pPr>
-        <w:ind w:left="5760" w:hanging="360"/>
+        <w:ind w:left="5400" w:hanging="360"/>
       </w:pPr>
     </w:lvl>
     <w:lvl w:ilvl="8" w:tplc="1009001B" w:tentative="1">
@@ -3966,7 +3877,7 @@
       <w:lvlText w:val="%9."/>
       <w:lvlJc w:val="right"/>
       <w:pPr>
-        <w:ind w:left="6480" w:hanging="180"/>
+        <w:ind w:left="6120" w:hanging="180"/>
       </w:pPr>
     </w:lvl>
   </w:abstractNum>
@@ -4066,7 +3977,7 @@
       <w:lvlText w:val="%1."/>
       <w:lvlJc w:val="left"/>
       <w:pPr>
-        <w:ind w:left="720" w:hanging="360"/>
+        <w:ind w:left="360" w:hanging="360"/>
       </w:pPr>
     </w:lvl>
     <w:lvl w:ilvl="1" w:tplc="10090019" w:tentative="1">
@@ -4075,7 +3986,7 @@
       <w:lvlText w:val="%2."/>
       <w:lvlJc w:val="left"/>
       <w:pPr>
-        <w:ind w:left="1440" w:hanging="360"/>
+        <w:ind w:left="1080" w:hanging="360"/>
       </w:pPr>
     </w:lvl>
     <w:lvl w:ilvl="2" w:tplc="1009001B" w:tentative="1">
@@ -4084,7 +3995,7 @@
       <w:lvlText w:val="%3."/>
       <w:lvlJc w:val="right"/>
       <w:pPr>
-        <w:ind w:left="2160" w:hanging="180"/>
+        <w:ind w:left="1800" w:hanging="180"/>
       </w:pPr>
     </w:lvl>
     <w:lvl w:ilvl="3" w:tplc="1009000F" w:tentative="1">
@@ -4093,7 +4004,7 @@
       <w:lvlText w:val="%4."/>
       <w:lvlJc w:val="left"/>
       <w:pPr>
-        <w:ind w:left="2880" w:hanging="360"/>
+        <w:ind w:left="2520" w:hanging="360"/>
       </w:pPr>
     </w:lvl>
     <w:lvl w:ilvl="4" w:tplc="10090019" w:tentative="1">
@@ -4102,7 +4013,7 @@
       <w:lvlText w:val="%5."/>
       <w:lvlJc w:val="left"/>
       <w:pPr>
-        <w:ind w:left="3600" w:hanging="360"/>
+        <w:ind w:left="3240" w:hanging="360"/>
       </w:pPr>
     </w:lvl>
     <w:lvl w:ilvl="5" w:tplc="1009001B" w:tentative="1">
@@ -4111,7 +4022,7 @@
       <w:lvlText w:val="%6."/>
       <w:lvlJc w:val="right"/>
       <w:pPr>
-        <w:ind w:left="4320" w:hanging="180"/>
+        <w:ind w:left="3960" w:hanging="180"/>
       </w:pPr>
     </w:lvl>
     <w:lvl w:ilvl="6" w:tplc="1009000F" w:tentative="1">
@@ -4120,7 +4031,7 @@
       <w:lvlText w:val="%7."/>
       <w:lvlJc w:val="left"/>
       <w:pPr>
-        <w:ind w:left="5040" w:hanging="360"/>
+        <w:ind w:left="4680" w:hanging="360"/>
       </w:pPr>
     </w:lvl>
     <w:lvl w:ilvl="7" w:tplc="10090019" w:tentative="1">
@@ -4129,7 +4040,7 @@
       <w:lvlText w:val="%8."/>
       <w:lvlJc w:val="left"/>
       <w:pPr>
-        <w:ind w:left="5760" w:hanging="360"/>
+        <w:ind w:left="5400" w:hanging="360"/>
       </w:pPr>
     </w:lvl>
     <w:lvl w:ilvl="8" w:tplc="1009001B" w:tentative="1">
@@ -4138,7 +4049,7 @@
       <w:lvlText w:val="%9."/>
       <w:lvlJc w:val="right"/>
       <w:pPr>
-        <w:ind w:left="6480" w:hanging="180"/>
+        <w:ind w:left="6120" w:hanging="180"/>
       </w:pPr>
     </w:lvl>
   </w:abstractNum>
@@ -4459,18 +4370,20 @@
   <w:abstractNum w:abstractNumId="12" w15:restartNumberingAfterBreak="0">
     <w:nsid w:val="700C3E00"/>
     <w:multiLevelType w:val="hybridMultilevel"/>
-    <w:tmpl w:val="4F920252"/>
-    <w:lvl w:ilvl="0" w:tplc="472CBA34">
+    <w:tmpl w:val="A82AEE90"/>
+    <w:lvl w:ilvl="0" w:tplc="911698F0">
       <w:start w:val="1"/>
       <w:numFmt w:val="decimal"/>
       <w:lvlText w:val="%1."/>
       <w:lvlJc w:val="left"/>
       <w:pPr>
-        <w:ind w:left="720" w:hanging="360"/>
+        <w:ind w:left="360" w:hanging="360"/>
       </w:pPr>
       <w:rPr>
         <w:i w:val="0"/>
         <w:iCs w:val="0"/>
+        <w:sz w:val="24"/>
+        <w:szCs w:val="24"/>
       </w:rPr>
     </w:lvl>
     <w:lvl w:ilvl="1" w:tplc="10090019" w:tentative="1">
@@ -4479,7 +4392,7 @@
       <w:lvlText w:val="%2."/>
       <w:lvlJc w:val="left"/>
       <w:pPr>
-        <w:ind w:left="1440" w:hanging="360"/>
+        <w:ind w:left="1080" w:hanging="360"/>
       </w:pPr>
     </w:lvl>
     <w:lvl w:ilvl="2" w:tplc="1009001B" w:tentative="1">
@@ -4488,7 +4401,7 @@
       <w:lvlText w:val="%3."/>
       <w:lvlJc w:val="right"/>
       <w:pPr>
-        <w:ind w:left="2160" w:hanging="180"/>
+        <w:ind w:left="1800" w:hanging="180"/>
       </w:pPr>
     </w:lvl>
     <w:lvl w:ilvl="3" w:tplc="1009000F" w:tentative="1">
@@ -4497,7 +4410,7 @@
       <w:lvlText w:val="%4."/>
       <w:lvlJc w:val="left"/>
       <w:pPr>
-        <w:ind w:left="2880" w:hanging="360"/>
+        <w:ind w:left="2520" w:hanging="360"/>
       </w:pPr>
     </w:lvl>
     <w:lvl w:ilvl="4" w:tplc="10090019" w:tentative="1">
@@ -4506,7 +4419,7 @@
       <w:lvlText w:val="%5."/>
       <w:lvlJc w:val="left"/>
       <w:pPr>
-        <w:ind w:left="3600" w:hanging="360"/>
+        <w:ind w:left="3240" w:hanging="360"/>
       </w:pPr>
     </w:lvl>
     <w:lvl w:ilvl="5" w:tplc="1009001B" w:tentative="1">
@@ -4515,7 +4428,7 @@
       <w:lvlText w:val="%6."/>
       <w:lvlJc w:val="right"/>
       <w:pPr>
-        <w:ind w:left="4320" w:hanging="180"/>
+        <w:ind w:left="3960" w:hanging="180"/>
       </w:pPr>
     </w:lvl>
     <w:lvl w:ilvl="6" w:tplc="1009000F" w:tentative="1">
@@ -4524,7 +4437,7 @@
       <w:lvlText w:val="%7."/>
       <w:lvlJc w:val="left"/>
       <w:pPr>
-        <w:ind w:left="5040" w:hanging="360"/>
+        <w:ind w:left="4680" w:hanging="360"/>
       </w:pPr>
     </w:lvl>
     <w:lvl w:ilvl="7" w:tplc="10090019" w:tentative="1">
@@ -4533,7 +4446,7 @@
       <w:lvlText w:val="%8."/>
       <w:lvlJc w:val="left"/>
       <w:pPr>
-        <w:ind w:left="5760" w:hanging="360"/>
+        <w:ind w:left="5400" w:hanging="360"/>
       </w:pPr>
     </w:lvl>
     <w:lvl w:ilvl="8" w:tplc="1009001B" w:tentative="1">
@@ -4542,7 +4455,7 @@
       <w:lvlText w:val="%9."/>
       <w:lvlJc w:val="right"/>
       <w:pPr>
-        <w:ind w:left="6480" w:hanging="180"/>
+        <w:ind w:left="6120" w:hanging="180"/>
       </w:pPr>
     </w:lvl>
   </w:abstractNum>
@@ -5202,6 +5115,7 @@
   <w:style w:type="character" w:default="1" w:styleId="DefaultParagraphFont">
     <w:name w:val="Default Paragraph Font"/>
     <w:uiPriority w:val="1"/>
+    <w:semiHidden/>
     <w:unhideWhenUsed/>
   </w:style>
   <w:style w:type="table" w:default="1" w:styleId="TableNormal">
@@ -5986,26 +5900,6 @@
 </file>
 
 <file path=customXml/item2.xml><?xml version="1.0" encoding="utf-8"?>
-<p:properties xmlns:p="http://schemas.microsoft.com/office/2006/metadata/properties" xmlns:xsi="http://www.w3.org/2001/XMLSchema-instance" xmlns:pc="http://schemas.microsoft.com/office/infopath/2007/PartnerControls">
-  <documentManagement>
-    <TaxCatchAll xmlns="38b325e6-602c-452a-8617-173bf47082c5" xsi:nil="true"/>
-    <lcf76f155ced4ddcb4097134ff3c332f xmlns="8cf100d1-0775-4feb-8634-62999c4541bc">
-      <Terms xmlns="http://schemas.microsoft.com/office/infopath/2007/PartnerControls"/>
-    </lcf76f155ced4ddcb4097134ff3c332f>
-  </documentManagement>
-</p:properties>
-</file>
-
-<file path=customXml/item3.xml><?xml version="1.0" encoding="utf-8"?>
-<?mso-contentType ?>
-<FormTemplates xmlns="http://schemas.microsoft.com/sharepoint/v3/contenttype/forms">
-  <Display>DocumentLibraryForm</Display>
-  <Edit>DocumentLibraryForm</Edit>
-  <New>DocumentLibraryForm</New>
-</FormTemplates>
-</file>
-
-<file path=customXml/item4.xml><?xml version="1.0" encoding="utf-8"?>
 <ct:contentTypeSchema xmlns:ct="http://schemas.microsoft.com/office/2006/metadata/contentType" xmlns:ma="http://schemas.microsoft.com/office/2006/metadata/properties/metaAttributes" ct:_="" ma:_="" ma:contentTypeName="Document" ma:contentTypeID="0x010100456CAEA290209545A9F8681F83603874" ma:contentTypeVersion="19" ma:contentTypeDescription="Create a new document." ma:contentTypeScope="" ma:versionID="4bf10bb897fc0ef406baa02b9d664253">
   <xsd:schema xmlns:xsd="http://www.w3.org/2001/XMLSchema" xmlns:xs="http://www.w3.org/2001/XMLSchema" xmlns:p="http://schemas.microsoft.com/office/2006/metadata/properties" xmlns:ns2="8cf100d1-0775-4feb-8634-62999c4541bc" xmlns:ns3="38b325e6-602c-452a-8617-173bf47082c5" targetNamespace="http://schemas.microsoft.com/office/2006/metadata/properties" ma:root="true" ma:fieldsID="1c6be4edf2b996d6a6f54fa7c1dd8d7b" ns2:_="" ns3:_="">
     <xsd:import namespace="8cf100d1-0775-4feb-8634-62999c4541bc"/>
@@ -6260,6 +6154,26 @@
 </ct:contentTypeSchema>
 </file>
 
+<file path=customXml/item3.xml><?xml version="1.0" encoding="utf-8"?>
+<?mso-contentType ?>
+<FormTemplates xmlns="http://schemas.microsoft.com/sharepoint/v3/contenttype/forms">
+  <Display>DocumentLibraryForm</Display>
+  <Edit>DocumentLibraryForm</Edit>
+  <New>DocumentLibraryForm</New>
+</FormTemplates>
+</file>
+
+<file path=customXml/item4.xml><?xml version="1.0" encoding="utf-8"?>
+<p:properties xmlns:p="http://schemas.microsoft.com/office/2006/metadata/properties" xmlns:xsi="http://www.w3.org/2001/XMLSchema-instance" xmlns:pc="http://schemas.microsoft.com/office/infopath/2007/PartnerControls">
+  <documentManagement>
+    <TaxCatchAll xmlns="38b325e6-602c-452a-8617-173bf47082c5" xsi:nil="true"/>
+    <lcf76f155ced4ddcb4097134ff3c332f xmlns="8cf100d1-0775-4feb-8634-62999c4541bc">
+      <Terms xmlns="http://schemas.microsoft.com/office/infopath/2007/PartnerControls"/>
+    </lcf76f155ced4ddcb4097134ff3c332f>
+  </documentManagement>
+</p:properties>
+</file>
+
 <file path=customXml/itemProps1.xml><?xml version="1.0" encoding="utf-8"?>
 <ds:datastoreItem xmlns:ds="http://schemas.openxmlformats.org/officeDocument/2006/customXml" ds:itemID="{C438ADBA-56D5-474C-BF2C-97C24DDF66BD}">
   <ds:schemaRefs>
@@ -6269,25 +6183,6 @@
 </file>
 
 <file path=customXml/itemProps2.xml><?xml version="1.0" encoding="utf-8"?>
-<ds:datastoreItem xmlns:ds="http://schemas.openxmlformats.org/officeDocument/2006/customXml" ds:itemID="{3A085C18-819E-4466-9494-DD461C39C2B0}">
-  <ds:schemaRefs>
-    <ds:schemaRef ds:uri="http://schemas.microsoft.com/office/2006/metadata/properties"/>
-    <ds:schemaRef ds:uri="http://schemas.microsoft.com/office/infopath/2007/PartnerControls"/>
-    <ds:schemaRef ds:uri="38b325e6-602c-452a-8617-173bf47082c5"/>
-    <ds:schemaRef ds:uri="8cf100d1-0775-4feb-8634-62999c4541bc"/>
-  </ds:schemaRefs>
-</ds:datastoreItem>
-</file>
-
-<file path=customXml/itemProps3.xml><?xml version="1.0" encoding="utf-8"?>
-<ds:datastoreItem xmlns:ds="http://schemas.openxmlformats.org/officeDocument/2006/customXml" ds:itemID="{2585761D-1AE9-4796-83E7-A2FC381967AF}">
-  <ds:schemaRefs>
-    <ds:schemaRef ds:uri="http://schemas.microsoft.com/sharepoint/v3/contenttype/forms"/>
-  </ds:schemaRefs>
-</ds:datastoreItem>
-</file>
-
-<file path=customXml/itemProps4.xml><?xml version="1.0" encoding="utf-8"?>
 <ds:datastoreItem xmlns:ds="http://schemas.openxmlformats.org/officeDocument/2006/customXml" ds:itemID="{15E4A59A-D2AE-4F48-812F-3D1D6F930385}">
   <ds:schemaRefs>
     <ds:schemaRef ds:uri="http://schemas.microsoft.com/office/2006/metadata/contentType"/>
@@ -6304,4 +6199,23 @@
     <ds:schemaRef ds:uri="http://schemas.microsoft.com/internal/obd"/>
   </ds:schemaRefs>
 </ds:datastoreItem>
+</file>
+
+<file path=customXml/itemProps3.xml><?xml version="1.0" encoding="utf-8"?>
+<ds:datastoreItem xmlns:ds="http://schemas.openxmlformats.org/officeDocument/2006/customXml" ds:itemID="{2585761D-1AE9-4796-83E7-A2FC381967AF}">
+  <ds:schemaRefs>
+    <ds:schemaRef ds:uri="http://schemas.microsoft.com/sharepoint/v3/contenttype/forms"/>
+  </ds:schemaRefs>
+</ds:datastoreItem>
+</file>
+
+<file path=customXml/itemProps4.xml><?xml version="1.0" encoding="utf-8"?>
+<ds:datastoreItem xmlns:ds="http://schemas.openxmlformats.org/officeDocument/2006/customXml" ds:itemID="{3A085C18-819E-4466-9494-DD461C39C2B0}">
+  <ds:schemaRefs>
+    <ds:schemaRef ds:uri="http://schemas.microsoft.com/office/2006/metadata/properties"/>
+    <ds:schemaRef ds:uri="http://schemas.microsoft.com/office/infopath/2007/PartnerControls"/>
+    <ds:schemaRef ds:uri="38b325e6-602c-452a-8617-173bf47082c5"/>
+    <ds:schemaRef ds:uri="8cf100d1-0775-4feb-8634-62999c4541bc"/>
+  </ds:schemaRefs>
+</ds:datastoreItem>
 </file>
</xml_diff>